<commit_message>
App guide 6 update
</commit_message>
<xml_diff>
--- a/docs/guides/Clariq_Guide_6_Sales_and_Accounts.docx
+++ b/docs/guides/Clariq_Guide_6_Sales_and_Accounts.docx
@@ -1710,6 +1710,19 @@
           <w:sz w:val="21"/>
         </w:rPr>
         <w:t xml:space="preserve">You see product groups, never product names, container numbers or who supplies them. That is the level the customer agreed to, and saying so is usually the fastest way to get a customer to raise it.</w:t>
+      </w:r>
+    </w:p>
+    <w:p>
+      <w:pPr>
+        <w:spacing w:after="120" w:before="0"/>
+      </w:pPr>
+      <w:r>
+        <w:rPr>
+          <w:b w:val="0"/>
+          <w:i w:val="0"/>
+          <w:sz w:val="21"/>
+        </w:rPr>
+        <w:t xml:space="preserve">The choice is theirs and it is self service. Each customer picks in their own Settings whether we see nothing, a summary, or their whole register, and they can change it at any time. We cannot set it for them and support cannot switch it on, so never tell a customer the report looks broken: it is working exactly as they configured it.</w:t>
       </w:r>
     </w:p>
     <w:p>

</xml_diff>